<commit_message>
docs: refine search and sorting analysis report
</commit_message>
<xml_diff>
--- a/report-04-search-and-sort/report/Relatorio-04-Busca-Ordenacao.docx
+++ b/report-04-search-and-sort/report/Relatorio-04-Busca-Ordenacao.docx
@@ -66,7 +66,7 @@
     </w:p>
     <w:p>
       <w:r>
-        <w:t>Foi utilizado cnes_estabelecimentos.csv, extraído do Cadastro Nacional de Estabelecimentos de Saúde (CNES) no Portal de Dados Abertos. A base possui 636.647 registros e 36 colunas. Uma validação sobre o arquivo integral confirmou que CO_UNIDADE possui 636.647 valores distintos e não está ordenada de forma crescente nem decrescente no arquivo original. Por isso, essa coluna atende simultaneamente aos dois requisitos do enunciado.</w:t>
+        <w:t>Foi utilizado cnes_estabelecimentos.csv, extraído do Cadastro Nacional de Estabelecimentos de Saúde (CNES) no Portal de Dados Abertos. A base possui 636.647 registros e 36 colunas. A validação foi executada sobre o arquivo integral: o script reduzir.py lê CO_UNIDADE como texto, verifica valores ausentes com isna(), unicidade com is_unique e ausência de ordenação crescente/decrescente com is_monotonic_increasing e is_monotonic_decreasing. O resultado foi 636.647 valores distintos e ausência de ordenação no arquivo original. Por isso, CO_UNIDADE atende simultaneamente aos dois requisitos do enunciado.</w:t>
       </w:r>
     </w:p>
     <w:p>
@@ -266,11 +266,7 @@
           </w:tcPr>
           <w:p>
             <w:r>
-              <w:rPr>
-                <w:rFonts w:ascii="Arial" w:hAnsi="Arial"/>
-                <w:sz w:val="15"/>
-              </w:rPr>
-              <w:t>Validação de unicidade e de não ordenação no arquivo integral.</w:t>
+              <w:t>Verificação no arquivo integral com isna(), is_unique e monotonicidade crescente/decrescente.</w:t>
             </w:r>
           </w:p>
         </w:tc>
@@ -287,11 +283,7 @@
           </w:tcPr>
           <w:p>
             <w:r>
-              <w:rPr>
-                <w:rFonts w:ascii="Arial" w:hAnsi="Arial"/>
-                <w:sz w:val="15"/>
-              </w:rPr>
-              <w:t>É única e não está ordenada, atendendo aos requisitos.</w:t>
+              <w:t>Comprovar, de forma reproduzível, que a chave é única e não está ordenada.</w:t>
             </w:r>
           </w:p>
         </w:tc>
@@ -870,7 +862,7 @@
     </w:p>
     <w:p>
       <w:r>
-        <w:t>A contagem de comparações é a principal evidência lógica, pois é determinística. O contador long long é incrementado exatamente quando CO_UNIDADE do vetor é comparada ao alvo. Os tempos são medidos com clock(); inicio e fim envolvem somente a operação analisada e a diferença é dividida por CLOCKS_PER_SEC. O arquivo físico é restaurado antes de cada repetição para impedir contaminação entre testes.</w:t>
+        <w:t>A contagem de comparações é a principal evidência lógica, pois é determinística. O contador long long é incrementado exatamente quando CO_UNIDADE do vetor é comparada ao alvo. Os tempos são medidos com clock(); início e fim envolvem somente a operação analisada e a diferença é dividida por CLOCKS_PER_SEC. O arquivo físico é restaurado antes de cada repetição para impedir contaminação entre testes. Para a versão final, estatisticas.csv, comparacao_teorica.csv, crescimento_n.csv, as tabelas e os gráficos deste relatório correspondem à mesma execução experimental final; após a coleta, os resultados foram congelados para manter rastreabilidade entre dados, figuras e texto.</w:t>
       </w:r>
     </w:p>
     <w:p>
@@ -1134,7 +1126,7 @@
     </w:p>
     <w:p>
       <w:r>
-        <w:t>Para K verificações, a Solução 1 tem custo de busca Θ(KN) quando K é pequeno em relação a N; considerando o crescimento da base pelas inserções, o limite geral inclui Θ(K²). Na Solução 2, a ordenação inicial custa Θ(N log N) e as K buscas custam Θ(K log N). Contudo, esta implementação mantém o vetor ordenado deslocando elementos após cada inserção válida, custo Θ(N) no pior caso por inserção. Para I inserções:</w:t>
+        <w:t>Para K verificações, a Solução 1 pode percorrer uma base que cresce a cada inserção; por isso, no pior caso, seu custo total é O(KN + K²). Na Solução 2, a ordenação inicial custa Θ(N log N), cada busca binária custa O(log(N+I)) e cada inserção válida no vetor ordenado pode deslocar O(N+I) elementos. Assim, para I inserções, o custo global deve considerar também o crescimento do índice.</w:t>
       </w:r>
     </w:p>
     <w:p>
@@ -1148,7 +1140,7 @@
           <w:b/>
           <w:sz w:val="22"/>
         </w:rPr>
-        <w:t>Solução 1: Θ(KN + K²)</w:t>
+        <w:t>Solução 1 (pior caso): O(KN + K²)</w:t>
       </w:r>
     </w:p>
     <w:p>
@@ -1162,12 +1154,12 @@
           <w:b/>
           <w:sz w:val="22"/>
         </w:rPr>
-        <w:t>Solução 2 completa: Θ(N log N + K log N + I·N)</w:t>
+        <w:t>Solução 2 completa (pior caso): O(N log N + K log(N+I) + IN + I²)</w:t>
       </w:r>
     </w:p>
     <w:p>
       <w:r>
-        <w:t>Se o cenário for predominantemente de consultas, ou se a estrutura ordenada for mantida por uma estrutura de inserção mais eficiente, a vantagem da busca binária torna-se ainda mais relevante. Aqui, o termo I·N é explicitado para não confundir complexidade da busca com complexidade da solução completa.</w:t>
+        <w:t>No experimento principal, N=1000 e I=K/2≤40, portanto I≪N. Nesse cenário controlado, os termos K log(N+I) e IN dominam a manutenção observada e a expressão pode ser interpretada, de forma aproximada, como O(N log N + K log N + I·N). Essa hipótese é declarada explicitamente para não confundir a complexidade isolada da busca binária com a complexidade da solução completa.</w:t>
       </w:r>
     </w:p>
     <w:p>
@@ -2153,7 +2145,7 @@
           <w:i/>
           <w:sz w:val="16"/>
         </w:rPr>
-        <w:t>Figura 1 - Teoria × experimento no workload principal. A escala logarítmica permite visualizar as duas ordens de grandeza.</w:t>
+        <w:t>Figura 1 - Teoria × experimento no workload principal (N₀=1000, D=I=K/2). A escala logarítmica permite visualizar as duas ordens de grandeza.</w:t>
       </w:r>
     </w:p>
     <w:p>
@@ -2171,7 +2163,7 @@
     </w:p>
     <w:p>
       <w:r>
-        <w:t>Para observar diretamente a dependência em N, foi executado um segundo experimento com uma única chave ausente e bases de N=125,250,500,1000. Uma chave ausente força a busca sequencial a percorrer todo o vetor e força a binária a seguir até o intervalo vazio. Foram feitas 50 repetições para os tempos; a quantidade de comparações é determinística.</w:t>
+        <w:t>Para observar diretamente a dependência em N, foi executado um segundo experimento com uma única chave artificial garantidamente ausente (~~~~ALVO_AUSENTE~~~~) e bases de N=125,250,500,1000. Uma chave ausente força a busca sequencial a percorrer todo o vetor e força a binária a seguir até o intervalo vazio. Foram feitas 50 repetições para os tempos; a quantidade de comparações é determinística.</w:t>
       </w:r>
     </w:p>
     <w:tbl>
@@ -2803,7 +2795,7 @@
           <w:i/>
           <w:sz w:val="16"/>
         </w:rPr>
-        <w:t>Figura 2 - Crescimento por N. A busca sequencial dobra as comparações quando N dobra; a binária acrescenta aproximadamente uma comparação.</w:t>
+        <w:t>Figura 2 - Crescimento por N com alvo garantidamente ausente. A busca sequencial dobra as comparações quando N dobra; a binária acrescenta aproximadamente uma comparação.</w:t>
       </w:r>
     </w:p>
     <w:p>
@@ -2925,10 +2917,6 @@
           </w:tcPr>
           <w:p>
             <w:r>
-              <w:rPr>
-                <w:rFonts w:ascii="Arial" w:hAnsi="Arial"/>
-                <w:sz w:val="16"/>
-              </w:rPr>
               <w:t>125</w:t>
             </w:r>
           </w:p>
@@ -2946,11 +2934,7 @@
           </w:tcPr>
           <w:p>
             <w:r>
-              <w:rPr>
-                <w:rFonts w:ascii="Arial" w:hAnsi="Arial"/>
-                <w:sz w:val="16"/>
-              </w:rPr>
-              <w:t>0.000082</w:t>
+              <w:t>0.000120</w:t>
             </w:r>
           </w:p>
         </w:tc>
@@ -2967,11 +2951,7 @@
           </w:tcPr>
           <w:p>
             <w:r>
-              <w:rPr>
-                <w:rFonts w:ascii="Arial" w:hAnsi="Arial"/>
-                <w:sz w:val="16"/>
-              </w:rPr>
-              <w:t>0.000129</w:t>
+              <w:t>0.000020</w:t>
             </w:r>
           </w:p>
         </w:tc>
@@ -2990,10 +2970,6 @@
           </w:tcPr>
           <w:p>
             <w:r>
-              <w:rPr>
-                <w:rFonts w:ascii="Arial" w:hAnsi="Arial"/>
-                <w:sz w:val="16"/>
-              </w:rPr>
               <w:t>250</w:t>
             </w:r>
           </w:p>
@@ -3011,11 +2987,7 @@
           </w:tcPr>
           <w:p>
             <w:r>
-              <w:rPr>
-                <w:rFonts w:ascii="Arial" w:hAnsi="Arial"/>
-                <w:sz w:val="16"/>
-              </w:rPr>
-              <w:t>0.000180</w:t>
+              <w:t>0.000160</w:t>
             </w:r>
           </w:p>
         </w:tc>
@@ -3032,11 +3004,7 @@
           </w:tcPr>
           <w:p>
             <w:r>
-              <w:rPr>
-                <w:rFonts w:ascii="Arial" w:hAnsi="Arial"/>
-                <w:sz w:val="16"/>
-              </w:rPr>
-              <w:t>0.000168</w:t>
+              <w:t>0.000160</w:t>
             </w:r>
           </w:p>
         </w:tc>
@@ -3055,10 +3023,6 @@
           </w:tcPr>
           <w:p>
             <w:r>
-              <w:rPr>
-                <w:rFonts w:ascii="Arial" w:hAnsi="Arial"/>
-                <w:sz w:val="16"/>
-              </w:rPr>
               <w:t>500</w:t>
             </w:r>
           </w:p>
@@ -3076,11 +3040,7 @@
           </w:tcPr>
           <w:p>
             <w:r>
-              <w:rPr>
-                <w:rFonts w:ascii="Arial" w:hAnsi="Arial"/>
-                <w:sz w:val="16"/>
-              </w:rPr>
-              <w:t>0.000285</w:t>
+              <w:t>0.000180</w:t>
             </w:r>
           </w:p>
         </w:tc>
@@ -3097,11 +3057,7 @@
           </w:tcPr>
           <w:p>
             <w:r>
-              <w:rPr>
-                <w:rFonts w:ascii="Arial" w:hAnsi="Arial"/>
-                <w:sz w:val="16"/>
-              </w:rPr>
-              <w:t>0.000319</w:t>
+              <w:t>0.000440</w:t>
             </w:r>
           </w:p>
         </w:tc>
@@ -3120,10 +3076,6 @@
           </w:tcPr>
           <w:p>
             <w:r>
-              <w:rPr>
-                <w:rFonts w:ascii="Arial" w:hAnsi="Arial"/>
-                <w:sz w:val="16"/>
-              </w:rPr>
               <w:t>1000</w:t>
             </w:r>
           </w:p>
@@ -3141,11 +3093,7 @@
           </w:tcPr>
           <w:p>
             <w:r>
-              <w:rPr>
-                <w:rFonts w:ascii="Arial" w:hAnsi="Arial"/>
-                <w:sz w:val="16"/>
-              </w:rPr>
-              <w:t>0.000628</w:t>
+              <w:t>0.000560</w:t>
             </w:r>
           </w:p>
         </w:tc>
@@ -3162,11 +3110,7 @@
           </w:tcPr>
           <w:p>
             <w:r>
-              <w:rPr>
-                <w:rFonts w:ascii="Arial" w:hAnsi="Arial"/>
-                <w:sz w:val="16"/>
-              </w:rPr>
-              <w:t>0.000657</w:t>
+              <w:t>0.000600</w:t>
             </w:r>
           </w:p>
         </w:tc>
@@ -3226,12 +3170,12 @@
           <w:i/>
           <w:sz w:val="16"/>
         </w:rPr>
-        <w:t>Figura 3 - Tempos médios da ordenação para N variável; a linha pontilhada é uma referência N log₂N escalada.</w:t>
+        <w:t>Figura 3 - Tempos médios da ordenação na execução experimental final para N variável; a linha pontilhada é uma referência N log₂N escalada.</w:t>
       </w:r>
     </w:p>
     <w:p>
       <w:r>
-        <w:t>A Figura 3 é usada apenas como validação de tendência, não como prova matemática. O tempo cresce com N e acompanha a forma N log N em ordem de grandeza. Como os tempos são inferiores a 1 ms, diferenças entre as versões e pequenas oscilações podem ser causadas pela resolução de clock(), cache e overhead constante. A demonstração formal de Θ(N log N) permanece a evidência principal.</w:t>
+        <w:t>A Figura 3 é usada apenas como validação de tendência, não como prova matemática. O tempo cresce globalmente com N e permanece compatível com a forma N log N em ordem de grandeza. Como as medições são inferiores a 1 ms, pequenas oscilações e inversões pontuais entre as versões podem ser causadas pela resolução de clock(), cache e overhead constante. Por isso, a demonstração formal de Θ(N log N) e a contagem lógica são as evidências principais; o tempo é uma validação complementar.</w:t>
       </w:r>
     </w:p>
     <w:p>
@@ -3402,10 +3346,6 @@
           </w:tcPr>
           <w:p>
             <w:r>
-              <w:rPr>
-                <w:rFonts w:ascii="Arial" w:hAnsi="Arial"/>
-                <w:sz w:val="15"/>
-              </w:rPr>
               <w:t>10</w:t>
             </w:r>
           </w:p>
@@ -3423,11 +3363,7 @@
           </w:tcPr>
           <w:p>
             <w:r>
-              <w:rPr>
-                <w:rFonts w:ascii="Arial" w:hAnsi="Arial"/>
-                <w:sz w:val="15"/>
-              </w:rPr>
-              <w:t>0.000046</w:t>
+              <w:t>0.000000</w:t>
             </w:r>
           </w:p>
         </w:tc>
@@ -3444,11 +3380,7 @@
           </w:tcPr>
           <w:p>
             <w:r>
-              <w:rPr>
-                <w:rFonts w:ascii="Arial" w:hAnsi="Arial"/>
-                <w:sz w:val="15"/>
-              </w:rPr>
-              <w:t>0.000266</w:t>
+              <w:t>0.000100</w:t>
             </w:r>
           </w:p>
         </w:tc>
@@ -3465,11 +3397,7 @@
           </w:tcPr>
           <w:p>
             <w:r>
-              <w:rPr>
-                <w:rFonts w:ascii="Arial" w:hAnsi="Arial"/>
-                <w:sz w:val="15"/>
-              </w:rPr>
-              <w:t>0.000625</w:t>
+              <w:t>0.000550</w:t>
             </w:r>
           </w:p>
         </w:tc>
@@ -3486,11 +3414,7 @@
           </w:tcPr>
           <w:p>
             <w:r>
-              <w:rPr>
-                <w:rFonts w:ascii="Arial" w:hAnsi="Arial"/>
-                <w:sz w:val="15"/>
-              </w:rPr>
-              <w:t>0.000664</w:t>
+              <w:t>0.001300</w:t>
             </w:r>
           </w:p>
         </w:tc>
@@ -3509,10 +3433,6 @@
           </w:tcPr>
           <w:p>
             <w:r>
-              <w:rPr>
-                <w:rFonts w:ascii="Arial" w:hAnsi="Arial"/>
-                <w:sz w:val="15"/>
-              </w:rPr>
               <w:t>20</w:t>
             </w:r>
           </w:p>
@@ -3530,11 +3450,7 @@
           </w:tcPr>
           <w:p>
             <w:r>
-              <w:rPr>
-                <w:rFonts w:ascii="Arial" w:hAnsi="Arial"/>
-                <w:sz w:val="15"/>
-              </w:rPr>
-              <w:t>0.000090</w:t>
+              <w:t>0.000200</w:t>
             </w:r>
           </w:p>
         </w:tc>
@@ -3551,11 +3467,7 @@
           </w:tcPr>
           <w:p>
             <w:r>
-              <w:rPr>
-                <w:rFonts w:ascii="Arial" w:hAnsi="Arial"/>
-                <w:sz w:val="15"/>
-              </w:rPr>
-              <w:t>0.000402</w:t>
+              <w:t>0.001150</w:t>
             </w:r>
           </w:p>
         </w:tc>
@@ -3572,11 +3484,7 @@
           </w:tcPr>
           <w:p>
             <w:r>
-              <w:rPr>
-                <w:rFonts w:ascii="Arial" w:hAnsi="Arial"/>
-                <w:sz w:val="15"/>
-              </w:rPr>
-              <w:t>0.000678</w:t>
+              <w:t>0.000700</w:t>
             </w:r>
           </w:p>
         </w:tc>
@@ -3593,11 +3501,7 @@
           </w:tcPr>
           <w:p>
             <w:r>
-              <w:rPr>
-                <w:rFonts w:ascii="Arial" w:hAnsi="Arial"/>
-                <w:sz w:val="15"/>
-              </w:rPr>
-              <w:t>0.000722</w:t>
+              <w:t>0.001200</w:t>
             </w:r>
           </w:p>
         </w:tc>
@@ -3616,10 +3520,6 @@
           </w:tcPr>
           <w:p>
             <w:r>
-              <w:rPr>
-                <w:rFonts w:ascii="Arial" w:hAnsi="Arial"/>
-                <w:sz w:val="15"/>
-              </w:rPr>
               <w:t>40</w:t>
             </w:r>
           </w:p>
@@ -3637,11 +3537,7 @@
           </w:tcPr>
           <w:p>
             <w:r>
-              <w:rPr>
-                <w:rFonts w:ascii="Arial" w:hAnsi="Arial"/>
-                <w:sz w:val="15"/>
-              </w:rPr>
-              <w:t>0.000130</w:t>
+              <w:t>0.000450</w:t>
             </w:r>
           </w:p>
         </w:tc>
@@ -3658,11 +3554,7 @@
           </w:tcPr>
           <w:p>
             <w:r>
-              <w:rPr>
-                <w:rFonts w:ascii="Arial" w:hAnsi="Arial"/>
-                <w:sz w:val="15"/>
-              </w:rPr>
-              <w:t>0.000625</w:t>
+              <w:t>0.000800</w:t>
             </w:r>
           </w:p>
         </w:tc>
@@ -3679,11 +3571,7 @@
           </w:tcPr>
           <w:p>
             <w:r>
-              <w:rPr>
-                <w:rFonts w:ascii="Arial" w:hAnsi="Arial"/>
-                <w:sz w:val="15"/>
-              </w:rPr>
-              <w:t>0.000636</w:t>
+              <w:t>0.001500</w:t>
             </w:r>
           </w:p>
         </w:tc>
@@ -3700,11 +3588,7 @@
           </w:tcPr>
           <w:p>
             <w:r>
-              <w:rPr>
-                <w:rFonts w:ascii="Arial" w:hAnsi="Arial"/>
-                <w:sz w:val="15"/>
-              </w:rPr>
-              <w:t>0.000706</w:t>
+              <w:t>0.000500</w:t>
             </w:r>
           </w:p>
         </w:tc>
@@ -3723,10 +3607,6 @@
           </w:tcPr>
           <w:p>
             <w:r>
-              <w:rPr>
-                <w:rFonts w:ascii="Arial" w:hAnsi="Arial"/>
-                <w:sz w:val="15"/>
-              </w:rPr>
               <w:t>80</w:t>
             </w:r>
           </w:p>
@@ -3744,11 +3624,7 @@
           </w:tcPr>
           <w:p>
             <w:r>
-              <w:rPr>
-                <w:rFonts w:ascii="Arial" w:hAnsi="Arial"/>
-                <w:sz w:val="15"/>
-              </w:rPr>
-              <w:t>0.000256</w:t>
+              <w:t>0.000350</w:t>
             </w:r>
           </w:p>
         </w:tc>
@@ -3765,11 +3641,7 @@
           </w:tcPr>
           <w:p>
             <w:r>
-              <w:rPr>
-                <w:rFonts w:ascii="Arial" w:hAnsi="Arial"/>
-                <w:sz w:val="15"/>
-              </w:rPr>
-              <w:t>0.001081</w:t>
+              <w:t>0.000950</w:t>
             </w:r>
           </w:p>
         </w:tc>
@@ -3786,11 +3658,7 @@
           </w:tcPr>
           <w:p>
             <w:r>
-              <w:rPr>
-                <w:rFonts w:ascii="Arial" w:hAnsi="Arial"/>
-                <w:sz w:val="15"/>
-              </w:rPr>
-              <w:t>0.001277</w:t>
+              <w:t>0.001050</w:t>
             </w:r>
           </w:p>
         </w:tc>
@@ -3807,11 +3675,7 @@
           </w:tcPr>
           <w:p>
             <w:r>
-              <w:rPr>
-                <w:rFonts w:ascii="Arial" w:hAnsi="Arial"/>
-                <w:sz w:val="15"/>
-              </w:rPr>
-              <w:t>0.001487</w:t>
+              <w:t>0.000550</w:t>
             </w:r>
           </w:p>
         </w:tc>
@@ -3871,12 +3735,12 @@
           <w:i/>
           <w:sz w:val="16"/>
         </w:rPr>
-        <w:t>Figura 4 - Tempo médio do workload completo em 20 repetições por K.</w:t>
+        <w:t>Figura 4 - Tempo médio do workload completo na execução experimental final (20 repetições por K).</w:t>
       </w:r>
     </w:p>
     <w:p>
       <w:r>
-        <w:t>A Figura 4 deve ser interpretada junto às complexidades. Com N=1000, ordenar e manter o índice adiciona um custo fixo/linear que pode fazer a Solução 2 ter maior tempo total em K pequenos, mesmo executando muito menos comparações de busca. Isso não contradiz O(log N): o gráfico mede a solução completa, não somente a função busca_binaria. A separação entre “tempo de busca”, “tempo de ordenação” e “tempo de manutenção” está registrada em estatisticas.csv.</w:t>
+        <w:t>A Figura 4 deve ser interpretada junto às complexidades. Com N=1000, ordenar e manter o índice adiciona um custo que pode fazer a Solução 2 ter maior tempo total em alguns K pequenos, mesmo executando muito menos comparações de busca. Isso não contradiz Θ(log N): o gráfico mede a solução completa, não somente a função de busca binária. Valores iguais a 0,000000 s podem ocorrer quando a operação fica abaixo da resolução de clock(), razão pela qual a contagem de comparações é tratada como evidência principal. A correção funcional também foi confirmada: nas quatro implementações foram inseridos exatamente I=K/2 registros em cada cenário (5, 10, 20 e 40), sem introdução de duplicatas.</w:t>
       </w:r>
     </w:p>
     <w:p>
@@ -4553,7 +4417,7 @@
     </w:p>
     <w:p>
       <w:r>
-        <w:t>Os experimentos sustentam essas conclusões. No workload com N=1000, a fórmula exata da sequencial coincidiu com todos os dados observados e a binária permaneceu abaixo de seu limite teórico. No experimento variando N, a sequencial cresceu de 125 para 1000 comparações enquanto a binária cresceu de 7 para 10, tornando visível a diferença entre crescimento linear e logarítmico. Os tempos de execução foram tratados com cautela por serem muito pequenos e por incluírem custos adicionais da solução completa.</w:t>
+        <w:t>Os experimentos sustentam essas conclusões. No workload com N=1000, a fórmula exata da sequencial coincidiu com todos os dados observados e a binária permaneceu abaixo de seu limite teórico. No experimento variando N, a sequencial cresceu de 125 para 1000 comparações enquanto a binária cresceu de 7 para 10, tornando visível a diferença entre crescimento linear e logarítmico. Os tempos foram tratados como evidência complementar por sua pequena magnitude e resolução limitada; as contagens lógicas e as demonstrações formais permanecem a base da validação. Em todos os cenários, as quatro implementações produziram a quantidade esperada de inserções válidas, confirmando que a comparação de desempenho foi feita entre soluções funcionalmente equivalentes.</w:t>
       </w:r>
     </w:p>
     <w:p>

</xml_diff>